<commit_message>
voici la modifation du fichier word
</commit_message>
<xml_diff>
--- a/EXAMEN DE GENIE LOGICIEL GROUPE 9.docx
+++ b/EXAMEN DE GENIE LOGICIEL GROUPE 9.docx
@@ -1,6 +1,6 @@
 
 <file path=word/document.xml><?xml version="1.0" encoding="utf-8"?>
-<w:document xmlns:wpc="http://schemas.microsoft.com/office/word/2010/wordprocessingCanvas" xmlns:cx="http://schemas.microsoft.com/office/drawing/2014/chartex" xmlns:cx1="http://schemas.microsoft.com/office/drawing/2015/9/8/chartex" xmlns:cx2="http://schemas.microsoft.com/office/drawing/2015/10/21/chartex" xmlns:cx3="http://schemas.microsoft.com/office/drawing/2016/5/9/chartex" xmlns:cx4="http://schemas.microsoft.com/office/drawing/2016/5/10/chartex" xmlns:cx5="http://schemas.microsoft.com/office/drawing/2016/5/11/chartex" xmlns:cx6="http://schemas.microsoft.com/office/drawing/2016/5/12/chartex" xmlns:cx7="http://schemas.microsoft.com/office/drawing/2016/5/13/chartex" xmlns:cx8="http://schemas.microsoft.com/office/drawing/2016/5/14/chartex" xmlns:mc="http://schemas.openxmlformats.org/markup-compatibility/2006" xmlns:aink="http://schemas.microsoft.com/office/drawing/2016/ink" xmlns:am3d="http://schemas.microsoft.com/office/drawing/2017/model3d" xmlns:o="urn:schemas-microsoft-com:office:office" xmlns:r="http://schemas.openxmlformats.org/officeDocument/2006/relationships" xmlns:m="http://schemas.openxmlformats.org/officeDocument/2006/math" xmlns:v="urn:schemas-microsoft-com:vml" xmlns:wp14="http://schemas.microsoft.com/office/word/2010/wordprocessingDrawing" xmlns:wp="http://schemas.openxmlformats.org/drawingml/2006/wordprocessingDrawing" xmlns:w10="urn:schemas-microsoft-com:office:word" xmlns:w="http://schemas.openxmlformats.org/wordprocessingml/2006/main" xmlns:w14="http://schemas.microsoft.com/office/word/2010/wordml" xmlns:w15="http://schemas.microsoft.com/office/word/2012/wordml" xmlns:w16cex="http://schemas.microsoft.com/office/word/2018/wordml/cex" xmlns:w16cid="http://schemas.microsoft.com/office/word/2016/wordml/cid" xmlns:w16="http://schemas.microsoft.com/office/word/2018/wordml" xmlns:w16sdtdh="http://schemas.microsoft.com/office/word/2020/wordml/sdtdatahash" xmlns:w16se="http://schemas.microsoft.com/office/word/2015/wordml/symex" xmlns:wpg="http://schemas.microsoft.com/office/word/2010/wordprocessingGroup" xmlns:wpi="http://schemas.microsoft.com/office/word/2010/wordprocessingInk" xmlns:wne="http://schemas.microsoft.com/office/word/2006/wordml" xmlns:wps="http://schemas.microsoft.com/office/word/2010/wordprocessingShape" mc:Ignorable="w14 w15 w16se w16cid w16 w16cex w16sdtdh wp14">
+<w:document xmlns:wpc="http://schemas.microsoft.com/office/word/2010/wordprocessingCanvas" xmlns:cx="http://schemas.microsoft.com/office/drawing/2014/chartex" xmlns:cx1="http://schemas.microsoft.com/office/drawing/2015/9/8/chartex" xmlns:cx2="http://schemas.microsoft.com/office/drawing/2015/10/21/chartex" xmlns:cx3="http://schemas.microsoft.com/office/drawing/2016/5/9/chartex" xmlns:cx4="http://schemas.microsoft.com/office/drawing/2016/5/10/chartex" xmlns:cx5="http://schemas.microsoft.com/office/drawing/2016/5/11/chartex" xmlns:cx6="http://schemas.microsoft.com/office/drawing/2016/5/12/chartex" xmlns:cx7="http://schemas.microsoft.com/office/drawing/2016/5/13/chartex" xmlns:cx8="http://schemas.microsoft.com/office/drawing/2016/5/14/chartex" xmlns:mc="http://schemas.openxmlformats.org/markup-compatibility/2006" xmlns:aink="http://schemas.microsoft.com/office/drawing/2016/ink" xmlns:am3d="http://schemas.microsoft.com/office/drawing/2017/model3d" xmlns:o="urn:schemas-microsoft-com:office:office" xmlns:r="http://schemas.openxmlformats.org/officeDocument/2006/relationships" xmlns:m="http://schemas.openxmlformats.org/officeDocument/2006/math" xmlns:v="urn:schemas-microsoft-com:vml" xmlns:wp14="http://schemas.microsoft.com/office/word/2010/wordprocessingDrawing" xmlns:wp="http://schemas.openxmlformats.org/drawingml/2006/wordprocessingDrawing" xmlns:w10="urn:schemas-microsoft-com:office:word" xmlns:w="http://schemas.openxmlformats.org/wordprocessingml/2006/main" xmlns:w14="http://schemas.microsoft.com/office/word/2010/wordml" xmlns:w15="http://schemas.microsoft.com/office/word/2012/wordml" xmlns:w16cid="http://schemas.microsoft.com/office/word/2016/wordml/cid" xmlns:w16se="http://schemas.microsoft.com/office/word/2015/wordml/symex" xmlns:wpg="http://schemas.microsoft.com/office/word/2010/wordprocessingGroup" xmlns:wpi="http://schemas.microsoft.com/office/word/2010/wordprocessingInk" xmlns:wne="http://schemas.microsoft.com/office/word/2006/wordml" xmlns:wps="http://schemas.microsoft.com/office/word/2010/wordprocessingShape" mc:Ignorable="w14 w15 w16se w16cid wp14">
   <w:body>
     <w:p>
       <w:pPr>
@@ -421,6 +421,12 @@
                                 <w:rPr>
                                   <w:b/>
                                 </w:rPr>
+                                <w:t>O</w:t>
+                              </w:r>
+                              <w:r>
+                                <w:rPr>
+                                  <w:b/>
+                                </w:rPr>
                                 <w:t>MBENI MUVANGA DANIEL</w:t>
                               </w:r>
                             </w:p>
@@ -443,6 +449,8 @@
                                 </w:rPr>
                                 <w:t>OMBENI KASAMURA ALICE</w:t>
                               </w:r>
+                              <w:bookmarkStart w:id="0" w:name="_GoBack"/>
+                              <w:bookmarkEnd w:id="0"/>
                             </w:p>
                             <w:p>
                               <w:pPr>
@@ -1002,6 +1010,12 @@
                           <w:rPr>
                             <w:b/>
                           </w:rPr>
+                          <w:t>O</w:t>
+                        </w:r>
+                        <w:r>
+                          <w:rPr>
+                            <w:b/>
+                          </w:rPr>
                           <w:t>MBENI MUVANGA DANIEL</w:t>
                         </w:r>
                       </w:p>
@@ -1024,6 +1038,8 @@
                           </w:rPr>
                           <w:t>OMBENI KASAMURA ALICE</w:t>
                         </w:r>
+                        <w:bookmarkStart w:id="1" w:name="_GoBack"/>
+                        <w:bookmarkEnd w:id="1"/>
                       </w:p>
                       <w:p>
                         <w:pPr>
@@ -2604,7 +2620,7 @@
               </wp:anchor>
             </w:drawing>
           </mc:Choice>
-          <mc:Fallback>
+          <mc:Fallback xmlns:w16sdtdh="http://schemas.microsoft.com/office/word/2020/wordml/sdtdatahash" xmlns:w16="http://schemas.microsoft.com/office/word/2018/wordml" xmlns:w16cex="http://schemas.microsoft.com/office/word/2018/wordml/cex">
             <w:pict>
               <v:line w14:anchorId="690B7003" id="Connecteur droit 18" o:spid="_x0000_s1026" style="position:absolute;z-index:251713536;visibility:visible;mso-wrap-style:square;mso-width-percent:0;mso-wrap-distance-left:9pt;mso-wrap-distance-top:0;mso-wrap-distance-right:9pt;mso-wrap-distance-bottom:0;mso-position-horizontal:absolute;mso-position-horizontal-relative:text;mso-position-vertical:absolute;mso-position-vertical-relative:text;mso-width-percent:0;mso-width-relative:margin" from="164pt,319.85pt" to="490.7pt,319.85pt" o:gfxdata="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" strokecolor="#677c8d" strokeweight=".5pt">
                 <v:stroke dashstyle="dash" joinstyle="miter"/>
@@ -2886,7 +2902,7 @@
               </wp:anchor>
             </w:drawing>
           </mc:Choice>
-          <mc:Fallback>
+          <mc:Fallback xmlns:w16sdtdh="http://schemas.microsoft.com/office/word/2020/wordml/sdtdatahash" xmlns:w16="http://schemas.microsoft.com/office/word/2018/wordml" xmlns:w16cex="http://schemas.microsoft.com/office/word/2018/wordml/cex">
             <w:pict>
               <v:line w14:anchorId="08728250" id="Connecteur droit 39" o:spid="_x0000_s1026" style="position:absolute;z-index:251702272;visibility:visible;mso-wrap-style:square;mso-width-percent:0;mso-wrap-distance-left:9pt;mso-wrap-distance-top:0;mso-wrap-distance-right:9pt;mso-wrap-distance-bottom:0;mso-position-horizontal:absolute;mso-position-horizontal-relative:text;mso-position-vertical:absolute;mso-position-vertical-relative:text;mso-width-percent:0;mso-width-relative:margin" from="-11pt,415.45pt" to="102.3pt,415.45pt" o:gfxdata="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" strokecolor="#687896" strokeweight=".5pt">
                 <v:stroke dashstyle="dash" joinstyle="miter"/>
@@ -2966,7 +2982,7 @@
               </wp:anchor>
             </w:drawing>
           </mc:Choice>
-          <mc:Fallback>
+          <mc:Fallback xmlns:w16sdtdh="http://schemas.microsoft.com/office/word/2020/wordml/sdtdatahash" xmlns:w16="http://schemas.microsoft.com/office/word/2018/wordml" xmlns:w16cex="http://schemas.microsoft.com/office/word/2018/wordml/cex">
             <w:pict>
               <v:line w14:anchorId="422FBB6D" id="Connecteur droit 17" o:spid="_x0000_s1026" style="position:absolute;z-index:251664384;visibility:visible;mso-wrap-style:square;mso-width-percent:0;mso-wrap-distance-left:9pt;mso-wrap-distance-top:0;mso-wrap-distance-right:9pt;mso-wrap-distance-bottom:0;mso-position-horizontal:absolute;mso-position-horizontal-relative:text;mso-position-vertical:absolute;mso-position-vertical-relative:text;mso-width-percent:0;mso-width-relative:margin" from="160pt,177.25pt" to="486.7pt,177.25pt" o:gfxdata="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" strokecolor="#7e92a6" strokeweight=".5pt">
                 <v:stroke dashstyle="dash" joinstyle="miter"/>
@@ -3278,7 +3294,7 @@
               </wp:anchor>
             </w:drawing>
           </mc:Choice>
-          <mc:Fallback>
+          <mc:Fallback xmlns:w16sdtdh="http://schemas.microsoft.com/office/word/2020/wordml/sdtdatahash" xmlns:w16="http://schemas.microsoft.com/office/word/2018/wordml" xmlns:w16cex="http://schemas.microsoft.com/office/word/2018/wordml/cex">
             <w:pict>
               <v:line w14:anchorId="1438373B" id="Connecteur droit 35" o:spid="_x0000_s1026" style="position:absolute;z-index:251665408;visibility:visible;mso-wrap-style:square;mso-width-percent:0;mso-wrap-distance-left:9pt;mso-wrap-distance-top:0;mso-wrap-distance-right:9pt;mso-wrap-distance-bottom:0;mso-position-horizontal:absolute;mso-position-horizontal-relative:text;mso-position-vertical:absolute;mso-position-vertical-relative:text;mso-width-percent:0;mso-width-relative:margin" from="-3.9pt,336.3pt" to="94.75pt,336.3pt" o:gfxdata="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" strokecolor="white" strokeweight="2.25pt">
                 <v:stroke joinstyle="miter"/>
@@ -5718,7 +5734,7 @@
 </file>
 
 <file path=word/endnotes.xml><?xml version="1.0" encoding="utf-8"?>
-<w:endnotes xmlns:wpc="http://schemas.microsoft.com/office/word/2010/wordprocessingCanvas" xmlns:cx="http://schemas.microsoft.com/office/drawing/2014/chartex" xmlns:cx1="http://schemas.microsoft.com/office/drawing/2015/9/8/chartex" xmlns:cx2="http://schemas.microsoft.com/office/drawing/2015/10/21/chartex" xmlns:cx3="http://schemas.microsoft.com/office/drawing/2016/5/9/chartex" xmlns:cx4="http://schemas.microsoft.com/office/drawing/2016/5/10/chartex" xmlns:cx5="http://schemas.microsoft.com/office/drawing/2016/5/11/chartex" xmlns:cx6="http://schemas.microsoft.com/office/drawing/2016/5/12/chartex" xmlns:cx7="http://schemas.microsoft.com/office/drawing/2016/5/13/chartex" xmlns:cx8="http://schemas.microsoft.com/office/drawing/2016/5/14/chartex" xmlns:mc="http://schemas.openxmlformats.org/markup-compatibility/2006" xmlns:aink="http://schemas.microsoft.com/office/drawing/2016/ink" xmlns:am3d="http://schemas.microsoft.com/office/drawing/2017/model3d" xmlns:o="urn:schemas-microsoft-com:office:office" xmlns:r="http://schemas.openxmlformats.org/officeDocument/2006/relationships" xmlns:m="http://schemas.openxmlformats.org/officeDocument/2006/math" xmlns:v="urn:schemas-microsoft-com:vml" xmlns:wp14="http://schemas.microsoft.com/office/word/2010/wordprocessingDrawing" xmlns:wp="http://schemas.openxmlformats.org/drawingml/2006/wordprocessingDrawing" xmlns:w10="urn:schemas-microsoft-com:office:word" xmlns:w="http://schemas.openxmlformats.org/wordprocessingml/2006/main" xmlns:w14="http://schemas.microsoft.com/office/word/2010/wordml" xmlns:w15="http://schemas.microsoft.com/office/word/2012/wordml" xmlns:w16cex="http://schemas.microsoft.com/office/word/2018/wordml/cex" xmlns:w16cid="http://schemas.microsoft.com/office/word/2016/wordml/cid" xmlns:w16="http://schemas.microsoft.com/office/word/2018/wordml" xmlns:w16sdtdh="http://schemas.microsoft.com/office/word/2020/wordml/sdtdatahash" xmlns:w16se="http://schemas.microsoft.com/office/word/2015/wordml/symex" xmlns:wpg="http://schemas.microsoft.com/office/word/2010/wordprocessingGroup" xmlns:wpi="http://schemas.microsoft.com/office/word/2010/wordprocessingInk" xmlns:wne="http://schemas.microsoft.com/office/word/2006/wordml" xmlns:wps="http://schemas.microsoft.com/office/word/2010/wordprocessingShape" mc:Ignorable="w14 w15 w16se w16cid w16 w16cex w16sdtdh wp14">
+<w:endnotes xmlns:wpc="http://schemas.microsoft.com/office/word/2010/wordprocessingCanvas" xmlns:cx="http://schemas.microsoft.com/office/drawing/2014/chartex" xmlns:cx1="http://schemas.microsoft.com/office/drawing/2015/9/8/chartex" xmlns:cx2="http://schemas.microsoft.com/office/drawing/2015/10/21/chartex" xmlns:cx3="http://schemas.microsoft.com/office/drawing/2016/5/9/chartex" xmlns:cx4="http://schemas.microsoft.com/office/drawing/2016/5/10/chartex" xmlns:cx5="http://schemas.microsoft.com/office/drawing/2016/5/11/chartex" xmlns:cx6="http://schemas.microsoft.com/office/drawing/2016/5/12/chartex" xmlns:cx7="http://schemas.microsoft.com/office/drawing/2016/5/13/chartex" xmlns:cx8="http://schemas.microsoft.com/office/drawing/2016/5/14/chartex" xmlns:mc="http://schemas.openxmlformats.org/markup-compatibility/2006" xmlns:aink="http://schemas.microsoft.com/office/drawing/2016/ink" xmlns:am3d="http://schemas.microsoft.com/office/drawing/2017/model3d" xmlns:o="urn:schemas-microsoft-com:office:office" xmlns:r="http://schemas.openxmlformats.org/officeDocument/2006/relationships" xmlns:m="http://schemas.openxmlformats.org/officeDocument/2006/math" xmlns:v="urn:schemas-microsoft-com:vml" xmlns:wp14="http://schemas.microsoft.com/office/word/2010/wordprocessingDrawing" xmlns:wp="http://schemas.openxmlformats.org/drawingml/2006/wordprocessingDrawing" xmlns:w10="urn:schemas-microsoft-com:office:word" xmlns:w="http://schemas.openxmlformats.org/wordprocessingml/2006/main" xmlns:w14="http://schemas.microsoft.com/office/word/2010/wordml" xmlns:w15="http://schemas.microsoft.com/office/word/2012/wordml" xmlns:w16cid="http://schemas.microsoft.com/office/word/2016/wordml/cid" xmlns:w16se="http://schemas.microsoft.com/office/word/2015/wordml/symex" xmlns:wpg="http://schemas.microsoft.com/office/word/2010/wordprocessingGroup" xmlns:wpi="http://schemas.microsoft.com/office/word/2010/wordprocessingInk" xmlns:wne="http://schemas.microsoft.com/office/word/2006/wordml" xmlns:wps="http://schemas.microsoft.com/office/word/2010/wordprocessingShape" mc:Ignorable="w14 w15 w16se w16cid wp14">
   <w:endnote w:type="separator" w:id="-1">
     <w:p>
       <w:pPr>
@@ -5743,7 +5759,7 @@
 </file>
 
 <file path=word/footer1.xml><?xml version="1.0" encoding="utf-8"?>
-<w:ftr xmlns:wpc="http://schemas.microsoft.com/office/word/2010/wordprocessingCanvas" xmlns:cx="http://schemas.microsoft.com/office/drawing/2014/chartex" xmlns:cx1="http://schemas.microsoft.com/office/drawing/2015/9/8/chartex" xmlns:cx2="http://schemas.microsoft.com/office/drawing/2015/10/21/chartex" xmlns:cx3="http://schemas.microsoft.com/office/drawing/2016/5/9/chartex" xmlns:cx4="http://schemas.microsoft.com/office/drawing/2016/5/10/chartex" xmlns:cx5="http://schemas.microsoft.com/office/drawing/2016/5/11/chartex" xmlns:cx6="http://schemas.microsoft.com/office/drawing/2016/5/12/chartex" xmlns:cx7="http://schemas.microsoft.com/office/drawing/2016/5/13/chartex" xmlns:cx8="http://schemas.microsoft.com/office/drawing/2016/5/14/chartex" xmlns:mc="http://schemas.openxmlformats.org/markup-compatibility/2006" xmlns:aink="http://schemas.microsoft.com/office/drawing/2016/ink" xmlns:am3d="http://schemas.microsoft.com/office/drawing/2017/model3d" xmlns:o="urn:schemas-microsoft-com:office:office" xmlns:r="http://schemas.openxmlformats.org/officeDocument/2006/relationships" xmlns:m="http://schemas.openxmlformats.org/officeDocument/2006/math" xmlns:v="urn:schemas-microsoft-com:vml" xmlns:wp14="http://schemas.microsoft.com/office/word/2010/wordprocessingDrawing" xmlns:wp="http://schemas.openxmlformats.org/drawingml/2006/wordprocessingDrawing" xmlns:w10="urn:schemas-microsoft-com:office:word" xmlns:w="http://schemas.openxmlformats.org/wordprocessingml/2006/main" xmlns:w14="http://schemas.microsoft.com/office/word/2010/wordml" xmlns:w15="http://schemas.microsoft.com/office/word/2012/wordml" xmlns:w16cex="http://schemas.microsoft.com/office/word/2018/wordml/cex" xmlns:w16cid="http://schemas.microsoft.com/office/word/2016/wordml/cid" xmlns:w16="http://schemas.microsoft.com/office/word/2018/wordml" xmlns:w16sdtdh="http://schemas.microsoft.com/office/word/2020/wordml/sdtdatahash" xmlns:w16se="http://schemas.microsoft.com/office/word/2015/wordml/symex" xmlns:wpg="http://schemas.microsoft.com/office/word/2010/wordprocessingGroup" xmlns:wpi="http://schemas.microsoft.com/office/word/2010/wordprocessingInk" xmlns:wne="http://schemas.microsoft.com/office/word/2006/wordml" xmlns:wps="http://schemas.microsoft.com/office/word/2010/wordprocessingShape" mc:Ignorable="w14 w15 w16se w16cid w16 w16cex w16sdtdh wp14">
+<w:ftr xmlns:wpc="http://schemas.microsoft.com/office/word/2010/wordprocessingCanvas" xmlns:cx="http://schemas.microsoft.com/office/drawing/2014/chartex" xmlns:cx1="http://schemas.microsoft.com/office/drawing/2015/9/8/chartex" xmlns:cx2="http://schemas.microsoft.com/office/drawing/2015/10/21/chartex" xmlns:cx3="http://schemas.microsoft.com/office/drawing/2016/5/9/chartex" xmlns:cx4="http://schemas.microsoft.com/office/drawing/2016/5/10/chartex" xmlns:cx5="http://schemas.microsoft.com/office/drawing/2016/5/11/chartex" xmlns:cx6="http://schemas.microsoft.com/office/drawing/2016/5/12/chartex" xmlns:cx7="http://schemas.microsoft.com/office/drawing/2016/5/13/chartex" xmlns:cx8="http://schemas.microsoft.com/office/drawing/2016/5/14/chartex" xmlns:mc="http://schemas.openxmlformats.org/markup-compatibility/2006" xmlns:aink="http://schemas.microsoft.com/office/drawing/2016/ink" xmlns:am3d="http://schemas.microsoft.com/office/drawing/2017/model3d" xmlns:o="urn:schemas-microsoft-com:office:office" xmlns:r="http://schemas.openxmlformats.org/officeDocument/2006/relationships" xmlns:m="http://schemas.openxmlformats.org/officeDocument/2006/math" xmlns:v="urn:schemas-microsoft-com:vml" xmlns:wp14="http://schemas.microsoft.com/office/word/2010/wordprocessingDrawing" xmlns:wp="http://schemas.openxmlformats.org/drawingml/2006/wordprocessingDrawing" xmlns:w10="urn:schemas-microsoft-com:office:word" xmlns:w="http://schemas.openxmlformats.org/wordprocessingml/2006/main" xmlns:w14="http://schemas.microsoft.com/office/word/2010/wordml" xmlns:w15="http://schemas.microsoft.com/office/word/2012/wordml" xmlns:w16cid="http://schemas.microsoft.com/office/word/2016/wordml/cid" xmlns:w16se="http://schemas.microsoft.com/office/word/2015/wordml/symex" xmlns:wpg="http://schemas.microsoft.com/office/word/2010/wordprocessingGroup" xmlns:wpi="http://schemas.microsoft.com/office/word/2010/wordprocessingInk" xmlns:wne="http://schemas.microsoft.com/office/word/2006/wordml" xmlns:wps="http://schemas.microsoft.com/office/word/2010/wordprocessingShape" mc:Ignorable="w14 w15 w16se w16cid wp14">
   <w:p>
     <w:pPr>
       <w:pStyle w:val="En-tte"/>
@@ -5772,7 +5788,7 @@
 </file>
 
 <file path=word/footnotes.xml><?xml version="1.0" encoding="utf-8"?>
-<w:footnotes xmlns:wpc="http://schemas.microsoft.com/office/word/2010/wordprocessingCanvas" xmlns:cx="http://schemas.microsoft.com/office/drawing/2014/chartex" xmlns:cx1="http://schemas.microsoft.com/office/drawing/2015/9/8/chartex" xmlns:cx2="http://schemas.microsoft.com/office/drawing/2015/10/21/chartex" xmlns:cx3="http://schemas.microsoft.com/office/drawing/2016/5/9/chartex" xmlns:cx4="http://schemas.microsoft.com/office/drawing/2016/5/10/chartex" xmlns:cx5="http://schemas.microsoft.com/office/drawing/2016/5/11/chartex" xmlns:cx6="http://schemas.microsoft.com/office/drawing/2016/5/12/chartex" xmlns:cx7="http://schemas.microsoft.com/office/drawing/2016/5/13/chartex" xmlns:cx8="http://schemas.microsoft.com/office/drawing/2016/5/14/chartex" xmlns:mc="http://schemas.openxmlformats.org/markup-compatibility/2006" xmlns:aink="http://schemas.microsoft.com/office/drawing/2016/ink" xmlns:am3d="http://schemas.microsoft.com/office/drawing/2017/model3d" xmlns:o="urn:schemas-microsoft-com:office:office" xmlns:r="http://schemas.openxmlformats.org/officeDocument/2006/relationships" xmlns:m="http://schemas.openxmlformats.org/officeDocument/2006/math" xmlns:v="urn:schemas-microsoft-com:vml" xmlns:wp14="http://schemas.microsoft.com/office/word/2010/wordprocessingDrawing" xmlns:wp="http://schemas.openxmlformats.org/drawingml/2006/wordprocessingDrawing" xmlns:w10="urn:schemas-microsoft-com:office:word" xmlns:w="http://schemas.openxmlformats.org/wordprocessingml/2006/main" xmlns:w14="http://schemas.microsoft.com/office/word/2010/wordml" xmlns:w15="http://schemas.microsoft.com/office/word/2012/wordml" xmlns:w16cex="http://schemas.microsoft.com/office/word/2018/wordml/cex" xmlns:w16cid="http://schemas.microsoft.com/office/word/2016/wordml/cid" xmlns:w16="http://schemas.microsoft.com/office/word/2018/wordml" xmlns:w16sdtdh="http://schemas.microsoft.com/office/word/2020/wordml/sdtdatahash" xmlns:w16se="http://schemas.microsoft.com/office/word/2015/wordml/symex" xmlns:wpg="http://schemas.microsoft.com/office/word/2010/wordprocessingGroup" xmlns:wpi="http://schemas.microsoft.com/office/word/2010/wordprocessingInk" xmlns:wne="http://schemas.microsoft.com/office/word/2006/wordml" xmlns:wps="http://schemas.microsoft.com/office/word/2010/wordprocessingShape" mc:Ignorable="w14 w15 w16se w16cid w16 w16cex w16sdtdh wp14">
+<w:footnotes xmlns:wpc="http://schemas.microsoft.com/office/word/2010/wordprocessingCanvas" xmlns:cx="http://schemas.microsoft.com/office/drawing/2014/chartex" xmlns:cx1="http://schemas.microsoft.com/office/drawing/2015/9/8/chartex" xmlns:cx2="http://schemas.microsoft.com/office/drawing/2015/10/21/chartex" xmlns:cx3="http://schemas.microsoft.com/office/drawing/2016/5/9/chartex" xmlns:cx4="http://schemas.microsoft.com/office/drawing/2016/5/10/chartex" xmlns:cx5="http://schemas.microsoft.com/office/drawing/2016/5/11/chartex" xmlns:cx6="http://schemas.microsoft.com/office/drawing/2016/5/12/chartex" xmlns:cx7="http://schemas.microsoft.com/office/drawing/2016/5/13/chartex" xmlns:cx8="http://schemas.microsoft.com/office/drawing/2016/5/14/chartex" xmlns:mc="http://schemas.openxmlformats.org/markup-compatibility/2006" xmlns:aink="http://schemas.microsoft.com/office/drawing/2016/ink" xmlns:am3d="http://schemas.microsoft.com/office/drawing/2017/model3d" xmlns:o="urn:schemas-microsoft-com:office:office" xmlns:r="http://schemas.openxmlformats.org/officeDocument/2006/relationships" xmlns:m="http://schemas.openxmlformats.org/officeDocument/2006/math" xmlns:v="urn:schemas-microsoft-com:vml" xmlns:wp14="http://schemas.microsoft.com/office/word/2010/wordprocessingDrawing" xmlns:wp="http://schemas.openxmlformats.org/drawingml/2006/wordprocessingDrawing" xmlns:w10="urn:schemas-microsoft-com:office:word" xmlns:w="http://schemas.openxmlformats.org/wordprocessingml/2006/main" xmlns:w14="http://schemas.microsoft.com/office/word/2010/wordml" xmlns:w15="http://schemas.microsoft.com/office/word/2012/wordml" xmlns:w16cid="http://schemas.microsoft.com/office/word/2016/wordml/cid" xmlns:w16se="http://schemas.microsoft.com/office/word/2015/wordml/symex" xmlns:wpg="http://schemas.microsoft.com/office/word/2010/wordprocessingGroup" xmlns:wpi="http://schemas.microsoft.com/office/word/2010/wordprocessingInk" xmlns:wne="http://schemas.microsoft.com/office/word/2006/wordml" xmlns:wps="http://schemas.microsoft.com/office/word/2010/wordprocessingShape" mc:Ignorable="w14 w15 w16se w16cid wp14">
   <w:footnote w:type="separator" w:id="-1">
     <w:p>
       <w:pPr>
@@ -5797,7 +5813,7 @@
 </file>
 
 <file path=word/header1.xml><?xml version="1.0" encoding="utf-8"?>
-<w:hdr xmlns:wpc="http://schemas.microsoft.com/office/word/2010/wordprocessingCanvas" xmlns:cx="http://schemas.microsoft.com/office/drawing/2014/chartex" xmlns:cx1="http://schemas.microsoft.com/office/drawing/2015/9/8/chartex" xmlns:cx2="http://schemas.microsoft.com/office/drawing/2015/10/21/chartex" xmlns:cx3="http://schemas.microsoft.com/office/drawing/2016/5/9/chartex" xmlns:cx4="http://schemas.microsoft.com/office/drawing/2016/5/10/chartex" xmlns:cx5="http://schemas.microsoft.com/office/drawing/2016/5/11/chartex" xmlns:cx6="http://schemas.microsoft.com/office/drawing/2016/5/12/chartex" xmlns:cx7="http://schemas.microsoft.com/office/drawing/2016/5/13/chartex" xmlns:cx8="http://schemas.microsoft.com/office/drawing/2016/5/14/chartex" xmlns:mc="http://schemas.openxmlformats.org/markup-compatibility/2006" xmlns:aink="http://schemas.microsoft.com/office/drawing/2016/ink" xmlns:am3d="http://schemas.microsoft.com/office/drawing/2017/model3d" xmlns:o="urn:schemas-microsoft-com:office:office" xmlns:r="http://schemas.openxmlformats.org/officeDocument/2006/relationships" xmlns:m="http://schemas.openxmlformats.org/officeDocument/2006/math" xmlns:v="urn:schemas-microsoft-com:vml" xmlns:wp14="http://schemas.microsoft.com/office/word/2010/wordprocessingDrawing" xmlns:wp="http://schemas.openxmlformats.org/drawingml/2006/wordprocessingDrawing" xmlns:w10="urn:schemas-microsoft-com:office:word" xmlns:w="http://schemas.openxmlformats.org/wordprocessingml/2006/main" xmlns:w14="http://schemas.microsoft.com/office/word/2010/wordml" xmlns:w15="http://schemas.microsoft.com/office/word/2012/wordml" xmlns:w16cex="http://schemas.microsoft.com/office/word/2018/wordml/cex" xmlns:w16cid="http://schemas.microsoft.com/office/word/2016/wordml/cid" xmlns:w16="http://schemas.microsoft.com/office/word/2018/wordml" xmlns:w16sdtdh="http://schemas.microsoft.com/office/word/2020/wordml/sdtdatahash" xmlns:w16se="http://schemas.microsoft.com/office/word/2015/wordml/symex" xmlns:wpg="http://schemas.microsoft.com/office/word/2010/wordprocessingGroup" xmlns:wpi="http://schemas.microsoft.com/office/word/2010/wordprocessingInk" xmlns:wne="http://schemas.microsoft.com/office/word/2006/wordml" xmlns:wps="http://schemas.microsoft.com/office/word/2010/wordprocessingShape" mc:Ignorable="w14 w15 w16se w16cid w16 w16cex w16sdtdh wp14">
+<w:hdr xmlns:wpc="http://schemas.microsoft.com/office/word/2010/wordprocessingCanvas" xmlns:cx="http://schemas.microsoft.com/office/drawing/2014/chartex" xmlns:cx1="http://schemas.microsoft.com/office/drawing/2015/9/8/chartex" xmlns:cx2="http://schemas.microsoft.com/office/drawing/2015/10/21/chartex" xmlns:cx3="http://schemas.microsoft.com/office/drawing/2016/5/9/chartex" xmlns:cx4="http://schemas.microsoft.com/office/drawing/2016/5/10/chartex" xmlns:cx5="http://schemas.microsoft.com/office/drawing/2016/5/11/chartex" xmlns:cx6="http://schemas.microsoft.com/office/drawing/2016/5/12/chartex" xmlns:cx7="http://schemas.microsoft.com/office/drawing/2016/5/13/chartex" xmlns:cx8="http://schemas.microsoft.com/office/drawing/2016/5/14/chartex" xmlns:mc="http://schemas.openxmlformats.org/markup-compatibility/2006" xmlns:aink="http://schemas.microsoft.com/office/drawing/2016/ink" xmlns:am3d="http://schemas.microsoft.com/office/drawing/2017/model3d" xmlns:o="urn:schemas-microsoft-com:office:office" xmlns:r="http://schemas.openxmlformats.org/officeDocument/2006/relationships" xmlns:m="http://schemas.openxmlformats.org/officeDocument/2006/math" xmlns:v="urn:schemas-microsoft-com:vml" xmlns:wp14="http://schemas.microsoft.com/office/word/2010/wordprocessingDrawing" xmlns:wp="http://schemas.openxmlformats.org/drawingml/2006/wordprocessingDrawing" xmlns:w10="urn:schemas-microsoft-com:office:word" xmlns:w="http://schemas.openxmlformats.org/wordprocessingml/2006/main" xmlns:w14="http://schemas.microsoft.com/office/word/2010/wordml" xmlns:w15="http://schemas.microsoft.com/office/word/2012/wordml" xmlns:w16cid="http://schemas.microsoft.com/office/word/2016/wordml/cid" xmlns:w16se="http://schemas.microsoft.com/office/word/2015/wordml/symex" xmlns:wpg="http://schemas.microsoft.com/office/word/2010/wordprocessingGroup" xmlns:wpi="http://schemas.microsoft.com/office/word/2010/wordprocessingInk" xmlns:wne="http://schemas.microsoft.com/office/word/2006/wordml" xmlns:wps="http://schemas.microsoft.com/office/word/2010/wordprocessingShape" mc:Ignorable="w14 w15 w16se w16cid wp14">
   <w:p>
     <w:pPr>
       <w:pStyle w:val="En-tte"/>
@@ -5831,7 +5847,7 @@
 </file>
 
 <file path=word/numbering.xml><?xml version="1.0" encoding="utf-8"?>
-<w:numbering xmlns:wpc="http://schemas.microsoft.com/office/word/2010/wordprocessingCanvas" xmlns:cx="http://schemas.microsoft.com/office/drawing/2014/chartex" xmlns:cx1="http://schemas.microsoft.com/office/drawing/2015/9/8/chartex" xmlns:cx2="http://schemas.microsoft.com/office/drawing/2015/10/21/chartex" xmlns:cx3="http://schemas.microsoft.com/office/drawing/2016/5/9/chartex" xmlns:cx4="http://schemas.microsoft.com/office/drawing/2016/5/10/chartex" xmlns:cx5="http://schemas.microsoft.com/office/drawing/2016/5/11/chartex" xmlns:cx6="http://schemas.microsoft.com/office/drawing/2016/5/12/chartex" xmlns:cx7="http://schemas.microsoft.com/office/drawing/2016/5/13/chartex" xmlns:cx8="http://schemas.microsoft.com/office/drawing/2016/5/14/chartex" xmlns:mc="http://schemas.openxmlformats.org/markup-compatibility/2006" xmlns:aink="http://schemas.microsoft.com/office/drawing/2016/ink" xmlns:am3d="http://schemas.microsoft.com/office/drawing/2017/model3d" xmlns:o="urn:schemas-microsoft-com:office:office" xmlns:r="http://schemas.openxmlformats.org/officeDocument/2006/relationships" xmlns:m="http://schemas.openxmlformats.org/officeDocument/2006/math" xmlns:v="urn:schemas-microsoft-com:vml" xmlns:wp14="http://schemas.microsoft.com/office/word/2010/wordprocessingDrawing" xmlns:wp="http://schemas.openxmlformats.org/drawingml/2006/wordprocessingDrawing" xmlns:w10="urn:schemas-microsoft-com:office:word" xmlns:w="http://schemas.openxmlformats.org/wordprocessingml/2006/main" xmlns:w14="http://schemas.microsoft.com/office/word/2010/wordml" xmlns:w15="http://schemas.microsoft.com/office/word/2012/wordml" xmlns:w16cex="http://schemas.microsoft.com/office/word/2018/wordml/cex" xmlns:w16cid="http://schemas.microsoft.com/office/word/2016/wordml/cid" xmlns:w16="http://schemas.microsoft.com/office/word/2018/wordml" xmlns:w16sdtdh="http://schemas.microsoft.com/office/word/2020/wordml/sdtdatahash" xmlns:w16se="http://schemas.microsoft.com/office/word/2015/wordml/symex" xmlns:wpg="http://schemas.microsoft.com/office/word/2010/wordprocessingGroup" xmlns:wpi="http://schemas.microsoft.com/office/word/2010/wordprocessingInk" xmlns:wne="http://schemas.microsoft.com/office/word/2006/wordml" xmlns:wps="http://schemas.microsoft.com/office/word/2010/wordprocessingShape" mc:Ignorable="w14 w15 w16se w16cid w16 w16cex w16sdtdh wp14">
+<w:numbering xmlns:wpc="http://schemas.microsoft.com/office/word/2010/wordprocessingCanvas" xmlns:cx="http://schemas.microsoft.com/office/drawing/2014/chartex" xmlns:cx1="http://schemas.microsoft.com/office/drawing/2015/9/8/chartex" xmlns:cx2="http://schemas.microsoft.com/office/drawing/2015/10/21/chartex" xmlns:cx3="http://schemas.microsoft.com/office/drawing/2016/5/9/chartex" xmlns:cx4="http://schemas.microsoft.com/office/drawing/2016/5/10/chartex" xmlns:cx5="http://schemas.microsoft.com/office/drawing/2016/5/11/chartex" xmlns:cx6="http://schemas.microsoft.com/office/drawing/2016/5/12/chartex" xmlns:cx7="http://schemas.microsoft.com/office/drawing/2016/5/13/chartex" xmlns:cx8="http://schemas.microsoft.com/office/drawing/2016/5/14/chartex" xmlns:mc="http://schemas.openxmlformats.org/markup-compatibility/2006" xmlns:aink="http://schemas.microsoft.com/office/drawing/2016/ink" xmlns:am3d="http://schemas.microsoft.com/office/drawing/2017/model3d" xmlns:o="urn:schemas-microsoft-com:office:office" xmlns:r="http://schemas.openxmlformats.org/officeDocument/2006/relationships" xmlns:m="http://schemas.openxmlformats.org/officeDocument/2006/math" xmlns:v="urn:schemas-microsoft-com:vml" xmlns:wp14="http://schemas.microsoft.com/office/word/2010/wordprocessingDrawing" xmlns:wp="http://schemas.openxmlformats.org/drawingml/2006/wordprocessingDrawing" xmlns:w10="urn:schemas-microsoft-com:office:word" xmlns:w="http://schemas.openxmlformats.org/wordprocessingml/2006/main" xmlns:w14="http://schemas.microsoft.com/office/word/2010/wordml" xmlns:w15="http://schemas.microsoft.com/office/word/2012/wordml" xmlns:w16cid="http://schemas.microsoft.com/office/word/2016/wordml/cid" xmlns:w16se="http://schemas.microsoft.com/office/word/2015/wordml/symex" xmlns:wpg="http://schemas.microsoft.com/office/word/2010/wordprocessingGroup" xmlns:wpi="http://schemas.microsoft.com/office/word/2010/wordprocessingInk" xmlns:wne="http://schemas.microsoft.com/office/word/2006/wordml" xmlns:wps="http://schemas.microsoft.com/office/word/2010/wordprocessingShape" mc:Ignorable="w14 w15 w16se w16cid wp14">
   <w:abstractNum w:abstractNumId="0" w15:restartNumberingAfterBreak="0">
     <w:nsid w:val="FFFFFF89"/>
     <w:multiLevelType w:val="singleLevel"/>
@@ -10205,7 +10221,7 @@
 </file>
 
 <file path=word/styles.xml><?xml version="1.0" encoding="utf-8"?>
-<w:styles xmlns:mc="http://schemas.openxmlformats.org/markup-compatibility/2006" xmlns:r="http://schemas.openxmlformats.org/officeDocument/2006/relationships" xmlns:w="http://schemas.openxmlformats.org/wordprocessingml/2006/main" xmlns:w14="http://schemas.microsoft.com/office/word/2010/wordml" xmlns:w15="http://schemas.microsoft.com/office/word/2012/wordml" xmlns:w16cex="http://schemas.microsoft.com/office/word/2018/wordml/cex" xmlns:w16cid="http://schemas.microsoft.com/office/word/2016/wordml/cid" xmlns:w16="http://schemas.microsoft.com/office/word/2018/wordml" xmlns:w16sdtdh="http://schemas.microsoft.com/office/word/2020/wordml/sdtdatahash" xmlns:w16se="http://schemas.microsoft.com/office/word/2015/wordml/symex" mc:Ignorable="w14 w15 w16se w16cid w16 w16cex w16sdtdh">
+<w:styles xmlns:mc="http://schemas.openxmlformats.org/markup-compatibility/2006" xmlns:r="http://schemas.openxmlformats.org/officeDocument/2006/relationships" xmlns:w="http://schemas.openxmlformats.org/wordprocessingml/2006/main" xmlns:w14="http://schemas.microsoft.com/office/word/2010/wordml" xmlns:w15="http://schemas.microsoft.com/office/word/2012/wordml" xmlns:w16cid="http://schemas.microsoft.com/office/word/2016/wordml/cid" xmlns:w16se="http://schemas.microsoft.com/office/word/2015/wordml/symex" mc:Ignorable="w14 w15 w16se w16cid">
   <w:docDefaults>
     <w:rPrDefault>
       <w:rPr>

</xml_diff>